<commit_message>
Revisión U05: numeración, CEs con letras oficiales y native VLAN simétrica
</commit_message>
<xml_diff>
--- a/docx/05-trunking-inter-vlan/05-trunking-inter-vlan.docx
+++ b/docx/05-trunking-inter-vlan/05-trunking-inter-vlan.docx
@@ -764,7 +764,7 @@
         <w:pStyle w:val="BlockText"/>
       </w:pPr>
       <w:r>
-        <w:t xml:space="preserve">Practica con los pares del curso: empezar siempre el resuelto para ver el estilo y luego intentar el por-resolver.</w:t>
+        <w:t xml:space="preserve">Practica con los pares del curso: mira 1-2 resueltos para coger el formato, luego intenta el por-resolver; consulta el resuelto solo cuando te atasques.</w:t>
       </w:r>
     </w:p>
     <w:p>
@@ -903,18 +903,18 @@
               <w:pStyle w:val="Compact"/>
             </w:pPr>
             <w:r>
-              <w:t xml:space="preserve">RA4</w:t>
-            </w:r>
-          </w:p>
-        </w:tc>
-        <w:tc>
-          <w:tcPr/>
-          <w:p>
-            <w:pPr>
-              <w:pStyle w:val="Compact"/>
-            </w:pPr>
-            <w:r>
-              <w:t xml:space="preserve">Encaminamiento entre redes</w:t>
+              <w:t xml:space="preserve">RA4·d)</w:t>
+            </w:r>
+          </w:p>
+        </w:tc>
+        <w:tc>
+          <w:tcPr/>
+          <w:p>
+            <w:pPr>
+              <w:pStyle w:val="Compact"/>
+            </w:pPr>
+            <w:r>
+              <w:t xml:space="preserve">Comandos de configuración</w:t>
             </w:r>
           </w:p>
         </w:tc>
@@ -938,29 +938,134 @@
               <w:pStyle w:val="Compact"/>
             </w:pPr>
             <w:r>
-              <w:t xml:space="preserve">RA5</w:t>
-            </w:r>
-          </w:p>
-        </w:tc>
-        <w:tc>
-          <w:tcPr/>
-          <w:p>
-            <w:pPr>
-              <w:pStyle w:val="Compact"/>
-            </w:pPr>
-            <w:r>
-              <w:t xml:space="preserve">Segmentación lógica y aislamiento</w:t>
-            </w:r>
-          </w:p>
-        </w:tc>
-        <w:tc>
-          <w:tcPr/>
-          <w:p>
-            <w:pPr>
-              <w:pStyle w:val="Compact"/>
-            </w:pPr>
-            <w:r>
-              <w:t xml:space="preserve">✅ Puntos 1, 3 y 6 + 💬 Entrevista (punto 8)</w:t>
+              <w:t xml:space="preserve">RA5·c)</w:t>
+            </w:r>
+          </w:p>
+        </w:tc>
+        <w:tc>
+          <w:tcPr/>
+          <w:p>
+            <w:pPr>
+              <w:pStyle w:val="Compact"/>
+            </w:pPr>
+            <w:r>
+              <w:t xml:space="preserve">Diagnóstico de incidencias</w:t>
+            </w:r>
+          </w:p>
+        </w:tc>
+        <w:tc>
+          <w:tcPr/>
+          <w:p>
+            <w:pPr>
+              <w:pStyle w:val="Compact"/>
+            </w:pPr>
+            <w:r>
+              <w:t xml:space="preserve">✅ Punto 2 + ⚡ Laboratorio (punto 8)</w:t>
+            </w:r>
+          </w:p>
+        </w:tc>
+      </w:tr>
+      <w:tr>
+        <w:tc>
+          <w:tcPr/>
+          <w:p>
+            <w:pPr>
+              <w:pStyle w:val="Compact"/>
+            </w:pPr>
+            <w:r>
+              <w:t xml:space="preserve">RA5·d)</w:t>
+            </w:r>
+          </w:p>
+        </w:tc>
+        <w:tc>
+          <w:tcPr/>
+          <w:p>
+            <w:pPr>
+              <w:pStyle w:val="Compact"/>
+            </w:pPr>
+            <w:r>
+              <w:t xml:space="preserve">Enlaces troncales</w:t>
+            </w:r>
+          </w:p>
+        </w:tc>
+        <w:tc>
+          <w:tcPr/>
+          <w:p>
+            <w:pPr>
+              <w:pStyle w:val="Compact"/>
+            </w:pPr>
+            <w:r>
+              <w:t xml:space="preserve">✅ Puntos 1-2 y 6 + 🤬 CONRAD y 💬 Entrevista (punto 8)</w:t>
+            </w:r>
+          </w:p>
+        </w:tc>
+      </w:tr>
+      <w:tr>
+        <w:tc>
+          <w:tcPr/>
+          <w:p>
+            <w:pPr>
+              <w:pStyle w:val="Compact"/>
+            </w:pPr>
+            <w:r>
+              <w:t xml:space="preserve">RA5·e)</w:t>
+            </w:r>
+          </w:p>
+        </w:tc>
+        <w:tc>
+          <w:tcPr/>
+          <w:p>
+            <w:pPr>
+              <w:pStyle w:val="Compact"/>
+            </w:pPr>
+            <w:r>
+              <w:t xml:space="preserve">Inter-VLAN con router</w:t>
+            </w:r>
+          </w:p>
+        </w:tc>
+        <w:tc>
+          <w:tcPr/>
+          <w:p>
+            <w:pPr>
+              <w:pStyle w:val="Compact"/>
+            </w:pPr>
+            <w:r>
+              <w:t xml:space="preserve">✅ Puntos 3-4 + ⭐ y 🕵️ (punto 8)</w:t>
+            </w:r>
+          </w:p>
+        </w:tc>
+      </w:tr>
+      <w:tr>
+        <w:tc>
+          <w:tcPr/>
+          <w:p>
+            <w:pPr>
+              <w:pStyle w:val="Compact"/>
+            </w:pPr>
+            <w:r>
+              <w:t xml:space="preserve">RA5·f)</w:t>
+            </w:r>
+          </w:p>
+        </w:tc>
+        <w:tc>
+          <w:tcPr/>
+          <w:p>
+            <w:pPr>
+              <w:pStyle w:val="Compact"/>
+            </w:pPr>
+            <w:r>
+              <w:t xml:space="preserve">Protocolos centralizados (VTP)</w:t>
+            </w:r>
+          </w:p>
+        </w:tc>
+        <w:tc>
+          <w:tcPr/>
+          <w:p>
+            <w:pPr>
+              <w:pStyle w:val="Compact"/>
+            </w:pPr>
+            <w:r>
+              <w:t xml:space="preserve">✅ Punto 5 + 🕵️ (punto 8)</w:t>
             </w:r>
           </w:p>
         </w:tc>
@@ -1828,7 +1933,18 @@
         <w:pStyle w:val="FirstParagraph"/>
       </w:pPr>
       <w:r>
-        <w:t xml:space="preserve">Sin el trunk, las VLANs de Ventas a un lado del edificio no llegarían a las del otro. Con él, un cable sostiene todas las VLANs del edificio. El mismo concepto se usa entre switch y router (punto 4) o entre switch y switch para los enlaces de core.</w:t>
+        <w:t xml:space="preserve">Sin el trunk, las VLANs de Ventas a un lado del edificio no llegarían a las del otro. Con él, un cable sostiene todas las VLANs del edificio. El mismo concepto se usa entre switch y router (</w:t>
+      </w:r>
+      <w:hyperlink r:id="rId13">
+        <w:r>
+          <w:rPr>
+            <w:rStyle w:val="Hyperlink"/>
+          </w:rPr>
+          <w:t xml:space="preserve">punto 3</w:t>
+        </w:r>
+      </w:hyperlink>
+      <w:r>
+        <w:t xml:space="preserve">) o entre switch y switch para los enlaces de core.</w:t>
       </w:r>
     </w:p>
     <w:p>
@@ -2582,7 +2698,7 @@
         <w:rPr>
           <w:rStyle w:val="VerbatimChar"/>
         </w:rPr>
-        <w:t xml:space="preserve">show interface trunk</w:t>
+        <w:t xml:space="preserve">show interfaces trunk</w:t>
       </w:r>
       <w:r>
         <w:t xml:space="preserve">.</w:t>
@@ -2827,7 +2943,19 @@
         <w:t xml:space="preserve"> </w:t>
       </w:r>
       <w:r>
-        <w:t xml:space="preserve">(0x8100) +</w:t>
+        <w:t xml:space="preserve">(2 bytes,</w:t>
+      </w:r>
+      <w:r>
+        <w:t xml:space="preserve"> </w:t>
+      </w:r>
+      <w:r>
+        <w:rPr>
+          <w:rStyle w:val="VerbatimChar"/>
+        </w:rPr>
+        <w:t xml:space="preserve">0x8100</w:t>
+      </w:r>
+      <w:r>
+        <w:t xml:space="preserve">) y</w:t>
       </w:r>
       <w:r>
         <w:t xml:space="preserve"> </w:t>
@@ -2843,23 +2971,7 @@
         <w:t xml:space="preserve"> </w:t>
       </w:r>
       <w:r>
-        <w:t xml:space="preserve">(PRI 3 bits + CFI 1 bit + VLAN ID 12 bits), 802.1p) y</w:t>
-      </w:r>
-      <w:r>
-        <w:t xml:space="preserve"> </w:t>
-      </w:r>
-      <w:r>
-        <w:rPr>
-          <w:b/>
-          <w:bCs/>
-        </w:rPr>
-        <w:t xml:space="preserve">VLAN ID</w:t>
-      </w:r>
-      <w:r>
-        <w:t xml:space="preserve"> </w:t>
-      </w:r>
-      <w:r>
-        <w:t xml:space="preserve">(12 bits).</w:t>
+        <w:t xml:space="preserve">(2 bytes: PRI 3 bits + CFI 1 bit + VLAN ID 12 bits).</w:t>
       </w:r>
     </w:p>
     <w:p>
@@ -3022,7 +3134,7 @@
         <w:t xml:space="preserve"> </w:t>
       </w:r>
       <w:r>
-        <w:t xml:space="preserve">(TPID + PRI + VLAN ID) dentro de cada trama para que viajen muchas VLANs por un único cable.</w:t>
+        <w:t xml:space="preserve">(TPID + TCI) dentro de cada trama para que viajen muchas VLANs por un único cable.</w:t>
       </w:r>
     </w:p>
     <w:p>
@@ -3507,7 +3619,7 @@
         <w:rPr>
           <w:rStyle w:val="VerbatimChar"/>
         </w:rPr>
-        <w:t xml:space="preserve">show interface trunk</w:t>
+        <w:t xml:space="preserve">show interfaces trunk</w:t>
       </w:r>
       <w:r>
         <w:t xml:space="preserve">,</w:t>
@@ -3551,7 +3663,7 @@
         <w:pStyle w:val="FirstParagraph"/>
       </w:pPr>
       <w:r>
-        <w:t xml:space="preserve">Este punto es el punto 8 porque condensa todo lo anterior en un solo montaje: VLANs (puntos 1-2), trunks (3), router (4) y hardening (7). Es también la base del ⚡ Laboratorio de tortura del punto 9.</w:t>
+        <w:t xml:space="preserve">Este punto es el montaje estrella de la unidad: en él concentras las VLANs que ya creaste en switching, los trunks del punto 1, el router-on-a-stick y el native/allowed, todo en un solo escenario. Es también la base del ⚡ Laboratorio de tortura del punto 8.</w:t>
       </w:r>
     </w:p>
     <w:p>
@@ -4367,7 +4479,7 @@
         <w:t xml:space="preserve"> </w:t>
       </w:r>
       <w:r>
-        <w:t xml:space="preserve">en cada extremo (Switch1 native 99, Switch2 native 1), exactamente como lo hará el Laboratorio del punto 9. El resultado:</w:t>
+        <w:t xml:space="preserve">en cada extremo (Switch1 native 99, Switch2 native 1), exactamente como lo hará el Laboratorio del punto 8. El resultado:</w:t>
       </w:r>
     </w:p>
     <w:p>
@@ -4382,7 +4494,7 @@
         <w:rPr>
           <w:rStyle w:val="VerbatimChar"/>
         </w:rPr>
-        <w:t xml:space="preserve">show interface trunk</w:t>
+        <w:t xml:space="preserve">show interfaces trunk</w:t>
       </w:r>
       <w:r>
         <w:t xml:space="preserve"> </w:t>
@@ -4854,39 +4966,6 @@
           <w:rStyle w:val="CommentTok"/>
         </w:rPr>
         <w:t xml:space="preserve"># switchport mode trunk</w:t>
-      </w:r>
-      <w:r>
-        <w:br/>
-      </w:r>
-      <w:r>
-        <w:rPr>
-          <w:rStyle w:val="ExtensionTok"/>
-        </w:rPr>
-        <w:t xml:space="preserve">Switch1</w:t>
-      </w:r>
-      <w:r>
-        <w:rPr>
-          <w:rStyle w:val="ErrorTok"/>
-        </w:rPr>
-        <w:t xml:space="preserve">(</w:t>
-      </w:r>
-      <w:r>
-        <w:rPr>
-          <w:rStyle w:val="ExtensionTok"/>
-        </w:rPr>
-        <w:t xml:space="preserve">config-if</w:t>
-      </w:r>
-      <w:r>
-        <w:rPr>
-          <w:rStyle w:val="KeywordTok"/>
-        </w:rPr>
-        <w:t xml:space="preserve">)</w:t>
-      </w:r>
-      <w:r>
-        <w:rPr>
-          <w:rStyle w:val="CommentTok"/>
-        </w:rPr>
-        <w:t xml:space="preserve"># switchport trunk native vlan 99</w:t>
       </w:r>
       <w:r>
         <w:br/>
@@ -5945,7 +6024,7 @@
         <w:t xml:space="preserve"> </w:t>
       </w:r>
       <w:r>
-        <w:t xml:space="preserve">del punto 9: el fallo intencionado de native VLAN se diagnostica exactamente con la fila 3.</w:t>
+        <w:t xml:space="preserve">del punto 8: el fallo intencionado de native VLAN se diagnostica exactamente con la fila 3.</w:t>
       </w:r>
     </w:p>
     <w:p>
@@ -6833,7 +6912,7 @@
         <w:pStyle w:val="FirstParagraph"/>
       </w:pPr>
       <w:r>
-        <w:t xml:space="preserve">En los puntos 1 y 3 conseguiste</w:t>
+        <w:t xml:space="preserve">En la unidad de switching conseguiste</w:t>
       </w:r>
       <w:r>
         <w:t xml:space="preserve"> </w:t>
@@ -7349,7 +7428,21 @@
         <w:t xml:space="preserve"> </w:t>
       </w:r>
       <w:r>
-        <w:t xml:space="preserve">(todos los inter-VLAN atraviesan el mismo cable), algo que ataca el switch de capa 3 del punto 5.</w:t>
+        <w:t xml:space="preserve">(todos los inter-VLAN atraviesan el mismo cable), algo que ataca el switch de capa 3 del</w:t>
+      </w:r>
+      <w:r>
+        <w:t xml:space="preserve"> </w:t>
+      </w:r>
+      <w:hyperlink r:id="rId14">
+        <w:r>
+          <w:rPr>
+            <w:rStyle w:val="Hyperlink"/>
+          </w:rPr>
+          <w:t xml:space="preserve">punto 4</w:t>
+        </w:r>
+      </w:hyperlink>
+      <w:r>
+        <w:t xml:space="preserve">.</w:t>
       </w:r>
     </w:p>
     <w:p>
@@ -9235,7 +9328,24 @@
         <w:pStyle w:val="FirstParagraph"/>
       </w:pPr>
       <w:r>
-        <w:t xml:space="preserve">En el punto 4 el router-on-a-stick hacía todo el trabajo de capa 3, pero toda la oficina se aferraba a una sola interfaz. En redes con cientos de usuarios eso cruje. Aquí llega la alternativa de los campus modernos: el propio switch se convierte en router.</w:t>
+        <w:t xml:space="preserve">En el</w:t>
+      </w:r>
+      <w:r>
+        <w:t xml:space="preserve"> </w:t>
+      </w:r>
+      <w:hyperlink r:id="rId13">
+        <w:r>
+          <w:rPr>
+            <w:rStyle w:val="Hyperlink"/>
+          </w:rPr>
+          <w:t xml:space="preserve">punto 3</w:t>
+        </w:r>
+      </w:hyperlink>
+      <w:r>
+        <w:t xml:space="preserve"> </w:t>
+      </w:r>
+      <w:r>
+        <w:t xml:space="preserve">el router-on-a-stick hacía todo el trabajo de capa 3, pero toda la oficina se aferraba a una sola interfaz. En redes con cientos de usuarios eso cruje. Aquí llega la alternativa de los campus modernos: el propio switch se convierte en router.</w:t>
       </w:r>
     </w:p>
     <w:p>
@@ -9450,7 +9560,7 @@
         <w:t xml:space="preserve"> </w:t>
       </w:r>
       <w:r>
-        <w:t xml:space="preserve">el cuello de botella del punto 4 no era el router en sí, era la</w:t>
+        <w:t xml:space="preserve">el cuello de botella del router-on-a-stick no era el router en sí, era la</w:t>
       </w:r>
       <w:r>
         <w:t xml:space="preserve"> </w:t>
@@ -10711,7 +10821,21 @@
         <w:pStyle w:val="FirstParagraph"/>
       </w:pPr>
       <w:r>
-        <w:t xml:space="preserve">El SVI de la VLAN de gestión es donde pones la IP del switch para administrarlo. Este truco lo verás también en el punto 8:</w:t>
+        <w:t xml:space="preserve">El SVI de la VLAN de gestión es donde pones la IP del switch para administrarlo. Este truco lo recoge también la checklist del</w:t>
+      </w:r>
+      <w:r>
+        <w:t xml:space="preserve"> </w:t>
+      </w:r>
+      <w:hyperlink r:id="rId16">
+        <w:r>
+          <w:rPr>
+            <w:rStyle w:val="Hyperlink"/>
+          </w:rPr>
+          <w:t xml:space="preserve">punto 6</w:t>
+        </w:r>
+      </w:hyperlink>
+      <w:r>
+        <w:t xml:space="preserve">:</w:t>
       </w:r>
     </w:p>
     <w:p>
@@ -11582,7 +11706,7 @@
         <w:pStyle w:val="FirstParagraph"/>
       </w:pPr>
       <w:r>
-        <w:t xml:space="preserve">En los puntos 3 y 4 te creaste las VLANs a mano en cada switch. Estos dos protocolos prometen automatizarlo. Aquí verás por qué la industria moderna te recomienda</w:t>
+        <w:t xml:space="preserve">Ya te creaste las VLANs a mano en cada switch — en la unidad de switching y en el punto anterior—. Estos dos protocolos prometen automatizarlo. Aquí verás por qué la industria moderna te recomienda</w:t>
       </w:r>
       <w:r>
         <w:t xml:space="preserve"> </w:t>
@@ -12688,7 +12812,24 @@
         <w:t xml:space="preserve"> </w:t>
       </w:r>
       <w:r>
-        <w:t xml:space="preserve">(punto 7).</w:t>
+        <w:t xml:space="preserve">(el</w:t>
+      </w:r>
+      <w:r>
+        <w:t xml:space="preserve"> </w:t>
+      </w:r>
+      <w:hyperlink r:id="rId16">
+        <w:r>
+          <w:rPr>
+            <w:rStyle w:val="Hyperlink"/>
+          </w:rPr>
+          <w:t xml:space="preserve">punto 6</w:t>
+        </w:r>
+      </w:hyperlink>
+      <w:r>
+        <w:t xml:space="preserve"> </w:t>
+      </w:r>
+      <w:r>
+        <w:t xml:space="preserve">lo desmonta).</w:t>
       </w:r>
     </w:p>
     <w:p>
@@ -13080,7 +13221,8 @@
       </w:r>
       <w:r>
         <w:rPr>
-          <w:rStyle w:val="VerbatimChar"/>
+          <w:b/>
+          <w:bCs/>
         </w:rPr>
         <w:t xml:space="preserve">propaga la base de datos del switch con mayor revision number</w:t>
       </w:r>
@@ -15020,7 +15162,7 @@
         <w:t xml:space="preserve">si la native VLAN transporta datos y todos usan la 1, el doble etiquetado es gratis</w:t>
       </w:r>
       <w:r>
-        <w:t xml:space="preserve">. Por eso el hardening del punto 3 (cambiar la native) no es un capricho.</w:t>
+        <w:t xml:space="preserve">. Por eso cambiar la native (el paso 3 de la checklist de abajo) no es un capricho.</w:t>
       </w:r>
     </w:p>
     <w:p>
@@ -15568,6 +15710,84 @@
           </w:p>
         </w:tc>
       </w:tr>
+      <w:tr>
+        <w:tc>
+          <w:tcPr/>
+          <w:p>
+            <w:pPr>
+              <w:pStyle w:val="Compact"/>
+            </w:pPr>
+            <w:r>
+              <w:t xml:space="preserve">9</w:t>
+            </w:r>
+          </w:p>
+        </w:tc>
+        <w:tc>
+          <w:tcPr/>
+          <w:p>
+            <w:pPr>
+              <w:pStyle w:val="Compact"/>
+            </w:pPr>
+            <w:r>
+              <w:rPr>
+                <w:b/>
+                <w:bCs/>
+              </w:rPr>
+              <w:t xml:space="preserve">VLAN de gestión</w:t>
+            </w:r>
+            <w:r>
+              <w:t xml:space="preserve"> </w:t>
+            </w:r>
+            <w:r>
+              <w:t xml:space="preserve">dedicada (IP del switch, lejos de los datos)</w:t>
+            </w:r>
+          </w:p>
+        </w:tc>
+        <w:tc>
+          <w:tcPr/>
+          <w:p>
+            <w:pPr>
+              <w:pStyle w:val="Compact"/>
+            </w:pPr>
+            <w:r>
+              <w:rPr>
+                <w:rStyle w:val="VerbatimChar"/>
+              </w:rPr>
+              <w:t xml:space="preserve">interface vlan 999</w:t>
+            </w:r>
+            <w:r>
+              <w:t xml:space="preserve"> </w:t>
+            </w:r>
+            <w:r>
+              <w:t xml:space="preserve">+</w:t>
+            </w:r>
+            <w:r>
+              <w:t xml:space="preserve"> </w:t>
+            </w:r>
+            <w:r>
+              <w:rPr>
+                <w:rStyle w:val="VerbatimChar"/>
+              </w:rPr>
+              <w:t xml:space="preserve">ip address …</w:t>
+            </w:r>
+            <w:r>
+              <w:t xml:space="preserve"> </w:t>
+            </w:r>
+            <w:r>
+              <w:t xml:space="preserve">+</w:t>
+            </w:r>
+            <w:r>
+              <w:t xml:space="preserve"> </w:t>
+            </w:r>
+            <w:r>
+              <w:rPr>
+                <w:rStyle w:val="VerbatimChar"/>
+              </w:rPr>
+              <w:t xml:space="preserve">ip default-gateway</w:t>
+            </w:r>
+          </w:p>
+        </w:tc>
+      </w:tr>
     </w:tbl>
     <w:p>
       <w:pPr>
@@ -15975,7 +16195,7 @@
         <w:t xml:space="preserve"> </w:t>
       </w:r>
       <w:r>
-        <w:t xml:space="preserve">en 8 pasos (access, nonegotiate, native alta, VLAN 1 prohibida, sin VTP) cierra los frentes clásicos.</w:t>
+        <w:t xml:space="preserve">en 9 pasos (access, nonegotiate, native alta, VLAN 1 prohibida, gestión aparte, sin VTP) cierra los frentes clásicos.</w:t>
       </w:r>
     </w:p>
     <w:bookmarkEnd w:id="89"/>
@@ -19352,7 +19572,7 @@
         <w:t xml:space="preserve"> </w:t>
       </w:r>
       <w:r>
-        <w:t xml:space="preserve">2. Trunk entre switch y router/SVL con native 99 y DTP desactivado (</w:t>
+        <w:t xml:space="preserve">2. Trunk entre switch y router/SVI con la native por defecto en ambos extremos y DTP desactivado (</w:t>
       </w:r>
       <w:r>
         <w:rPr>
@@ -20552,7 +20772,7 @@
         <w:t xml:space="preserve"> </w:t>
       </w:r>
       <w:r>
-        <w:t xml:space="preserve">son las que permites y usas: Buen diseño no apila 300 VLANs</w:t>
+        <w:t xml:space="preserve">son las que permites y usas: buen diseño no apila 300 VLANs</w:t>
       </w:r>
       <w:r>
         <w:t xml:space="preserve"> </w:t>
@@ -20661,6 +20881,30 @@
       </w:pPr>
       <w:r>
         <w:t xml:space="preserve">✅ Criterios de evaluación cubiertos (RA3/RA4/RA5)</w:t>
+      </w:r>
+    </w:p>
+    <w:p>
+      <w:pPr>
+        <w:pStyle w:val="FirstParagraph"/>
+      </w:pPr>
+      <w:r>
+        <w:rPr>
+          <w:b/>
+          <w:bCs/>
+        </w:rPr>
+        <w:t xml:space="preserve">RA4: Administra las funciones básicas de un router estableciendo opciones de configuración.</w:t>
+      </w:r>
+    </w:p>
+    <w:p>
+      <w:pPr>
+        <w:pStyle w:val="BodyText"/>
+      </w:pPr>
+      <w:r>
+        <w:rPr>
+          <w:b/>
+          <w:bCs/>
+        </w:rPr>
+        <w:t xml:space="preserve">RA5: Configura redes locales virtuales identificando su campo de aplicación.</w:t>
       </w:r>
     </w:p>
     <w:tbl>
@@ -20732,18 +20976,18 @@
               <w:pStyle w:val="Compact"/>
             </w:pPr>
             <w:r>
-              <w:t xml:space="preserve">Administración de conmutadores</w:t>
-            </w:r>
-          </w:p>
-        </w:tc>
-        <w:tc>
-          <w:tcPr/>
-          <w:p>
-            <w:pPr>
-              <w:pStyle w:val="Compact"/>
-            </w:pPr>
-            <w:r>
-              <w:t xml:space="preserve">✅ Puntos 1-2 y 7 + ⚡ Laboratorio</w:t>
+              <w:t xml:space="preserve">Administración de conmutadores (enlaces y segmentación)</w:t>
+            </w:r>
+          </w:p>
+        </w:tc>
+        <w:tc>
+          <w:tcPr/>
+          <w:p>
+            <w:pPr>
+              <w:pStyle w:val="Compact"/>
+            </w:pPr>
+            <w:r>
+              <w:t xml:space="preserve">✅ Puntos 1-2, 5 y 7 + ⚡ Laboratorio (punto 8)</w:t>
             </w:r>
           </w:p>
         </w:tc>
@@ -20756,29 +21000,29 @@
               <w:pStyle w:val="Compact"/>
             </w:pPr>
             <w:r>
-              <w:t xml:space="preserve">RA4</w:t>
-            </w:r>
-          </w:p>
-        </w:tc>
-        <w:tc>
-          <w:tcPr/>
-          <w:p>
-            <w:pPr>
-              <w:pStyle w:val="Compact"/>
-            </w:pPr>
-            <w:r>
-              <w:t xml:space="preserve">Enrutamiento entre redes</w:t>
-            </w:r>
-          </w:p>
-        </w:tc>
-        <w:tc>
-          <w:tcPr/>
-          <w:p>
-            <w:pPr>
-              <w:pStyle w:val="Compact"/>
-            </w:pPr>
-            <w:r>
-              <w:t xml:space="preserve">✅ Puntos 3-4 + 🧠 Atrévete (punto 8)</w:t>
+              <w:t xml:space="preserve">RA4·d)</w:t>
+            </w:r>
+          </w:p>
+        </w:tc>
+        <w:tc>
+          <w:tcPr/>
+          <w:p>
+            <w:pPr>
+              <w:pStyle w:val="Compact"/>
+            </w:pPr>
+            <w:r>
+              <w:t xml:space="preserve">Comandos de configuración</w:t>
+            </w:r>
+          </w:p>
+        </w:tc>
+        <w:tc>
+          <w:tcPr/>
+          <w:p>
+            <w:pPr>
+              <w:pStyle w:val="Compact"/>
+            </w:pPr>
+            <w:r>
+              <w:t xml:space="preserve">✅ Puntos 3-4 y 7 (relay) + 🧠 Atrévete a pensar (punto 8)</w:t>
             </w:r>
           </w:p>
         </w:tc>
@@ -20791,29 +21035,134 @@
               <w:pStyle w:val="Compact"/>
             </w:pPr>
             <w:r>
-              <w:t xml:space="preserve">RA5</w:t>
-            </w:r>
-          </w:p>
-        </w:tc>
-        <w:tc>
-          <w:tcPr/>
-          <w:p>
-            <w:pPr>
-              <w:pStyle w:val="Compact"/>
-            </w:pPr>
-            <w:r>
-              <w:t xml:space="preserve">Segmentación y aislamiento de tráfico</w:t>
-            </w:r>
-          </w:p>
-        </w:tc>
-        <w:tc>
-          <w:tcPr/>
-          <w:p>
-            <w:pPr>
-              <w:pStyle w:val="Compact"/>
-            </w:pPr>
-            <w:r>
-              <w:t xml:space="preserve">✅ Puntos 1, 5 y 6 + 💬 Entrevista (punto 8)</w:t>
+              <w:t xml:space="preserve">RA5·c)</w:t>
+            </w:r>
+          </w:p>
+        </w:tc>
+        <w:tc>
+          <w:tcPr/>
+          <w:p>
+            <w:pPr>
+              <w:pStyle w:val="Compact"/>
+            </w:pPr>
+            <w:r>
+              <w:t xml:space="preserve">Diagnóstico de incidencias</w:t>
+            </w:r>
+          </w:p>
+        </w:tc>
+        <w:tc>
+          <w:tcPr/>
+          <w:p>
+            <w:pPr>
+              <w:pStyle w:val="Compact"/>
+            </w:pPr>
+            <w:r>
+              <w:t xml:space="preserve">✅ Punto 2 + ⚡ Laboratorio (punto 8)</w:t>
+            </w:r>
+          </w:p>
+        </w:tc>
+      </w:tr>
+      <w:tr>
+        <w:tc>
+          <w:tcPr/>
+          <w:p>
+            <w:pPr>
+              <w:pStyle w:val="Compact"/>
+            </w:pPr>
+            <w:r>
+              <w:t xml:space="preserve">RA5·d)</w:t>
+            </w:r>
+          </w:p>
+        </w:tc>
+        <w:tc>
+          <w:tcPr/>
+          <w:p>
+            <w:pPr>
+              <w:pStyle w:val="Compact"/>
+            </w:pPr>
+            <w:r>
+              <w:t xml:space="preserve">Enlaces troncales</w:t>
+            </w:r>
+          </w:p>
+        </w:tc>
+        <w:tc>
+          <w:tcPr/>
+          <w:p>
+            <w:pPr>
+              <w:pStyle w:val="Compact"/>
+            </w:pPr>
+            <w:r>
+              <w:t xml:space="preserve">✅ Puntos 1-2 y 6 + 🤬 CONRAD y 💬 Entrevista (punto 8)</w:t>
+            </w:r>
+          </w:p>
+        </w:tc>
+      </w:tr>
+      <w:tr>
+        <w:tc>
+          <w:tcPr/>
+          <w:p>
+            <w:pPr>
+              <w:pStyle w:val="Compact"/>
+            </w:pPr>
+            <w:r>
+              <w:t xml:space="preserve">RA5·e)</w:t>
+            </w:r>
+          </w:p>
+        </w:tc>
+        <w:tc>
+          <w:tcPr/>
+          <w:p>
+            <w:pPr>
+              <w:pStyle w:val="Compact"/>
+            </w:pPr>
+            <w:r>
+              <w:t xml:space="preserve">Inter-VLAN con router</w:t>
+            </w:r>
+          </w:p>
+        </w:tc>
+        <w:tc>
+          <w:tcPr/>
+          <w:p>
+            <w:pPr>
+              <w:pStyle w:val="Compact"/>
+            </w:pPr>
+            <w:r>
+              <w:t xml:space="preserve">✅ Puntos 3-4 + ⭐ y 🕵️ (punto 8)</w:t>
+            </w:r>
+          </w:p>
+        </w:tc>
+      </w:tr>
+      <w:tr>
+        <w:tc>
+          <w:tcPr/>
+          <w:p>
+            <w:pPr>
+              <w:pStyle w:val="Compact"/>
+            </w:pPr>
+            <w:r>
+              <w:t xml:space="preserve">RA5·f)</w:t>
+            </w:r>
+          </w:p>
+        </w:tc>
+        <w:tc>
+          <w:tcPr/>
+          <w:p>
+            <w:pPr>
+              <w:pStyle w:val="Compact"/>
+            </w:pPr>
+            <w:r>
+              <w:t xml:space="preserve">Protocolos centralizados (VTP)</w:t>
+            </w:r>
+          </w:p>
+        </w:tc>
+        <w:tc>
+          <w:tcPr/>
+          <w:p>
+            <w:pPr>
+              <w:pStyle w:val="Compact"/>
+            </w:pPr>
+            <w:r>
+              <w:t xml:space="preserve">✅ Punto 5 + 🕵️ (punto 8)</w:t>
             </w:r>
           </w:p>
         </w:tc>

</xml_diff>